<commit_message>
Project 3 Final Report - minor code edits, final draft and presentation slides
</commit_message>
<xml_diff>
--- a/Project 3/Reports/Project 3 - Final Report.docx
+++ b/Project 3/Reports/Project 3 - Final Report.docx
@@ -98,25 +98,7 @@
         <w:rPr>
           <w:rFonts w:ascii="Times New Roman" w:hAnsi="Times New Roman" w:cs="Times New Roman"/>
         </w:rPr>
-        <w:t xml:space="preserve">, </w:t>
-      </w:r>
-      <w:r>
-        <w:rPr>
-          <w:rFonts w:ascii="Times New Roman" w:hAnsi="Times New Roman" w:cs="Times New Roman"/>
-        </w:rPr>
-        <w:t>one of the first prospective studies of cardiovascular disease. The study followed subjects living in Framingham, Massachusetts, over the course of 24 years collecting data during repeated visits on known cardiovascular disease risk factors and markers. The primary analysis of this report will focus on the 10-year probability of stroke for various risk profiles of interest</w:t>
-      </w:r>
-      <w:r>
-        <w:rPr>
-          <w:rFonts w:ascii="Times New Roman" w:hAnsi="Times New Roman" w:cs="Times New Roman"/>
-        </w:rPr>
-        <w:t xml:space="preserve"> to the investigator</w:t>
-      </w:r>
-      <w:r>
-        <w:rPr>
-          <w:rFonts w:ascii="Times New Roman" w:hAnsi="Times New Roman" w:cs="Times New Roman"/>
-        </w:rPr>
-        <w:t>.</w:t>
+        <w:t>, one of the first prospective studies of cardiovascular disease. The study followed subjects living in Framingham, Massachusetts, over the course of 24 years collecting data during repeated visits on known cardiovascular disease risk factors and markers. The primary analysis of this report will focus on the 10-year probability of stroke for various risk profiles of interest to the investigator.</w:t>
       </w:r>
       <w:r>
         <w:rPr>
@@ -128,25 +110,7 @@
         <w:rPr>
           <w:rFonts w:ascii="Times New Roman" w:hAnsi="Times New Roman" w:cs="Times New Roman"/>
         </w:rPr>
-        <w:t>Additionally, a</w:t>
-      </w:r>
-      <w:r>
-        <w:rPr>
-          <w:rFonts w:ascii="Times New Roman" w:hAnsi="Times New Roman" w:cs="Times New Roman"/>
-        </w:rPr>
-        <w:t xml:space="preserve"> secondary analysis will be conducted to examine the changes in </w:t>
-      </w:r>
-      <w:r>
-        <w:rPr>
-          <w:rFonts w:ascii="Times New Roman" w:hAnsi="Times New Roman" w:cs="Times New Roman"/>
-        </w:rPr>
-        <w:t xml:space="preserve">certain </w:t>
-      </w:r>
-      <w:r>
-        <w:rPr>
-          <w:rFonts w:ascii="Times New Roman" w:hAnsi="Times New Roman" w:cs="Times New Roman"/>
-        </w:rPr>
-        <w:t>risk factors over time to assess the necessity of a time-varying covariate analysis in the future.</w:t>
+        <w:t>Additionally, a secondary analysis will be conducted to examine the changes in certain risk factors over time to assess the necessity of a time-varying covariate analysis in the future.</w:t>
       </w:r>
     </w:p>
     <w:p>
@@ -225,21 +189,19 @@
         </w:rPr>
         <w:t>, as these events occurred prior to the start of the study period. As this analysis focused on baseline predictors of stroke, only observations from participants’ baseline visits were retained for the analysis.</w:t>
       </w:r>
-    </w:p>
-    <w:p>
-      <w:pPr>
-        <w:spacing w:after="0" w:line="480" w:lineRule="auto"/>
-        <w:rPr>
-          <w:rFonts w:ascii="Times New Roman" w:eastAsia="Aptos" w:hAnsi="Times New Roman" w:cs="Times New Roman"/>
-          <w:lang w:eastAsia="en-US"/>
-        </w:rPr>
-      </w:pPr>
-      <w:r>
-        <w:rPr>
-          <w:rFonts w:ascii="Times New Roman" w:eastAsia="Aptos" w:hAnsi="Times New Roman" w:cs="Times New Roman"/>
-          <w:lang w:eastAsia="en-US"/>
-        </w:rPr>
-        <w:t xml:space="preserve">A 10-year follow-up window was applied to all participants. The outcome of interest, stroke-free survival, was defined using two derived variables. The event indicator was coded as 1 if a stroke occurred within 10 years of baseline and prior to death, and 0 otherwise. The survival time variable was constructed as follows: if a stroke occurred within 10 years and prior to death, survival time was set to the time of stroke; if a participant died within 10 years without a prior stroke, survival time was set to the time of death; if neither event occurred within 10 years, the participant was right-censored at 3652.5 days. </w:t>
+      <w:r>
+        <w:rPr>
+          <w:rFonts w:ascii="Times New Roman" w:eastAsia="Aptos" w:hAnsi="Times New Roman" w:cs="Times New Roman"/>
+          <w:lang w:eastAsia="en-US"/>
+        </w:rPr>
+        <w:t xml:space="preserve"> Then a</w:t>
+      </w:r>
+      <w:r>
+        <w:rPr>
+          <w:rFonts w:ascii="Times New Roman" w:eastAsia="Aptos" w:hAnsi="Times New Roman" w:cs="Times New Roman"/>
+          <w:lang w:eastAsia="en-US"/>
+        </w:rPr>
+        <w:t xml:space="preserve"> 10-year follow-up window was applied to all participants. The outcome of interest, stroke-free survival, was defined using two derived variables. The event indicator was coded as 1 if a stroke occurred within 10 years of baseline and prior to death, and 0 otherwise. The survival time variable was constructed as follows: if a stroke occurred within 10 years and prior to death, survival time was set to the time of stroke; if a participant died within 10 years without a prior stroke, survival time was set to the time of death; if neither event occurred within 10 years, the participant was right-censored at 3652.5 days. </w:t>
       </w:r>
       <w:r>
         <w:rPr>
@@ -369,6 +331,13 @@
         </w:rPr>
         <w:t xml:space="preserve"> use of blood pressure medication, current smoking status, and total cholesterol. To ensure a consistent sample during variable selection, complete case analysis was first performed across all eight candidate variables. Backward selection using the Akaike Information Criterion (AIC) was then conducted separately for males and females, with systolic blood pressure, diabetes, and age forced into each model. Following variable selection, complete case analysis was repeated using only the final selected variables to maximize sample size for model fitting.</w:t>
       </w:r>
+      <w:r>
+        <w:rPr>
+          <w:rFonts w:ascii="Times New Roman" w:eastAsia="Aptos" w:hAnsi="Times New Roman" w:cs="Times New Roman"/>
+          <w:lang w:eastAsia="en-US"/>
+        </w:rPr>
+        <w:t xml:space="preserve"> Note that multicollinearity of the candidate variables was assessed prior to selection and no concerns arose.</w:t>
+      </w:r>
     </w:p>
     <w:p>
       <w:pPr>
@@ -462,14 +431,20 @@
         <w:rPr>
           <w:rFonts w:ascii="Times New Roman" w:hAnsi="Times New Roman" w:cs="Times New Roman"/>
         </w:rPr>
-        <w:t xml:space="preserve">Following the application of exclusion criteria, 4,402 individual participants were included in the analysis, composed of 1,930 males and 2,472 females. Participant characteristics are summarized </w:t>
-      </w:r>
-      <w:r>
-        <w:rPr>
-          <w:rFonts w:ascii="Times New Roman" w:hAnsi="Times New Roman" w:cs="Times New Roman"/>
-        </w:rPr>
         <w:lastRenderedPageBreak/>
-        <w:t>in Table 1. Approximately</w:t>
+        <w:t>Following the application of exclusion criteria, 4,402 individual participants were included in the analysis, composed of 1,930 males and 2,472 females. Participant characteristics are summarized</w:t>
+      </w:r>
+      <w:r>
+        <w:rPr>
+          <w:rFonts w:ascii="Times New Roman" w:hAnsi="Times New Roman" w:cs="Times New Roman"/>
+        </w:rPr>
+        <w:t xml:space="preserve"> below</w:t>
+      </w:r>
+      <w:r>
+        <w:rPr>
+          <w:rFonts w:ascii="Times New Roman" w:hAnsi="Times New Roman" w:cs="Times New Roman"/>
+        </w:rPr>
+        <w:t xml:space="preserve"> in Table 1. Approximately</w:t>
       </w:r>
       <w:r>
         <w:rPr>
@@ -511,7 +486,7 @@
         <w:rPr>
           <w:rFonts w:ascii="Times New Roman" w:hAnsi="Times New Roman" w:cs="Times New Roman"/>
         </w:rPr>
-        <w:t xml:space="preserve"> taking blood pressure medication, and </w:t>
+        <w:t xml:space="preserve"> taking blood pressure medication, </w:t>
       </w:r>
       <w:r>
         <w:rPr>
@@ -535,7 +510,27 @@
         <w:rPr>
           <w:rFonts w:ascii="Times New Roman" w:hAnsi="Times New Roman" w:cs="Times New Roman"/>
         </w:rPr>
-        <w:t xml:space="preserve"> compared to females. Both sexes had similar </w:t>
+        <w:t xml:space="preserve">, and had slightly higher </w:t>
+      </w:r>
+      <w:proofErr w:type="gramStart"/>
+      <w:r>
+        <w:rPr>
+          <w:rFonts w:ascii="Times New Roman" w:hAnsi="Times New Roman" w:cs="Times New Roman"/>
+        </w:rPr>
+        <w:t>BMI’s</w:t>
+      </w:r>
+      <w:proofErr w:type="gramEnd"/>
+      <w:r>
+        <w:rPr>
+          <w:rFonts w:ascii="Times New Roman" w:hAnsi="Times New Roman" w:cs="Times New Roman"/>
+        </w:rPr>
+        <w:t xml:space="preserve"> </w:t>
+      </w:r>
+      <w:r>
+        <w:rPr>
+          <w:rFonts w:ascii="Times New Roman" w:hAnsi="Times New Roman" w:cs="Times New Roman"/>
+        </w:rPr>
+        <w:t xml:space="preserve">compared to females. Both sexes had similar </w:t>
       </w:r>
       <w:r>
         <w:rPr>
@@ -547,13 +542,25 @@
         <w:rPr>
           <w:rFonts w:ascii="Times New Roman" w:hAnsi="Times New Roman" w:cs="Times New Roman"/>
         </w:rPr>
-        <w:t xml:space="preserve"> systolic blood pressure, age, total cholesterol and BMI. </w:t>
-      </w:r>
-      <w:r>
-        <w:rPr>
-          <w:rFonts w:ascii="Times New Roman" w:hAnsi="Times New Roman" w:cs="Times New Roman"/>
-        </w:rPr>
-        <w:t>The extent of missingness across all covariates is reported in Table 1</w:t>
+        <w:t xml:space="preserve"> systolic blood pressure, age,</w:t>
+      </w:r>
+      <w:r>
+        <w:rPr>
+          <w:rFonts w:ascii="Times New Roman" w:hAnsi="Times New Roman" w:cs="Times New Roman"/>
+        </w:rPr>
+        <w:t xml:space="preserve"> and</w:t>
+      </w:r>
+      <w:r>
+        <w:rPr>
+          <w:rFonts w:ascii="Times New Roman" w:hAnsi="Times New Roman" w:cs="Times New Roman"/>
+        </w:rPr>
+        <w:t xml:space="preserve"> total cholesterol. </w:t>
+      </w:r>
+      <w:r>
+        <w:rPr>
+          <w:rFonts w:ascii="Times New Roman" w:hAnsi="Times New Roman" w:cs="Times New Roman"/>
+        </w:rPr>
+        <w:t>The extent of missingness across all covariates is reported</w:t>
       </w:r>
       <w:r>
         <w:rPr>
@@ -584,14 +591,7 @@
           <w:rFonts w:ascii="Times New Roman" w:hAnsi="Times New Roman" w:cs="Times New Roman"/>
           <w:noProof/>
         </w:rPr>
-        <w:t xml:space="preserve"> Summary Statistics of </w:t>
-      </w:r>
-      <w:r>
-        <w:rPr>
-          <w:rFonts w:ascii="Times New Roman" w:hAnsi="Times New Roman" w:cs="Times New Roman"/>
-          <w:noProof/>
-        </w:rPr>
-        <w:t>Framingham Participants at Baseline Visits.</w:t>
+        <w:t xml:space="preserve"> Summary Statistics of Framingham Participants at Baseline Visits.</w:t>
       </w:r>
     </w:p>
     <w:p>
@@ -705,6 +705,7 @@
           <w:iCs/>
           <w:lang w:eastAsia="en-US"/>
         </w:rPr>
+        <w:lastRenderedPageBreak/>
         <w:t xml:space="preserve">3.1.1 </w:t>
       </w:r>
       <w:r>
@@ -757,7 +758,6 @@
           <w:rFonts w:ascii="Times New Roman" w:eastAsia="Aptos" w:hAnsi="Times New Roman" w:cs="Times New Roman"/>
           <w:lang w:eastAsia="en-US"/>
         </w:rPr>
-        <w:lastRenderedPageBreak/>
         <w:t>Kaplan-Meier curves stratified by each covariate are presented in Figures 1 and 2 for females and males respectively. In both sexes, clear separation between survival curves was observed for age, systolic blood pressure, diabetes status, and blood pressure medication use, with higher risk groups consistently showing lower stroke-free survival over the 10-year follow-up period. Prevalent coronary heart disease also showed notable separation in both sexes, though the high-risk group was small</w:t>
       </w:r>
       <w:r>
@@ -879,7 +879,7 @@
           <w:lang w:eastAsia="en-US"/>
         </w:rPr>
         <w:drawing>
-          <wp:inline distT="0" distB="0" distL="0" distR="0" wp14:anchorId="0271585C" wp14:editId="448E96C3">
+          <wp:inline distT="0" distB="0" distL="0" distR="0" wp14:anchorId="0271585C" wp14:editId="519BEE72">
             <wp:extent cx="5943600" cy="3448050"/>
             <wp:effectExtent l="0" t="0" r="0" b="6350"/>
             <wp:docPr id="452029285" name="Picture 2"/>
@@ -926,16 +926,50 @@
         <w:spacing w:after="0" w:line="480" w:lineRule="auto"/>
         <w:rPr>
           <w:rFonts w:ascii="Times New Roman" w:eastAsia="Aptos" w:hAnsi="Times New Roman" w:cs="Times New Roman"/>
-          <w:lang w:eastAsia="en-US"/>
-        </w:rPr>
-      </w:pPr>
-      <w:r>
-        <w:rPr>
-          <w:rFonts w:ascii="Times New Roman" w:eastAsia="Aptos" w:hAnsi="Times New Roman" w:cs="Times New Roman"/>
-          <w:b/>
-          <w:bCs/>
-          <w:lang w:eastAsia="en-US"/>
-        </w:rPr>
+          <w:b/>
+          <w:bCs/>
+          <w:lang w:eastAsia="en-US"/>
+        </w:rPr>
+      </w:pPr>
+    </w:p>
+    <w:p>
+      <w:pPr>
+        <w:spacing w:after="0" w:line="480" w:lineRule="auto"/>
+        <w:rPr>
+          <w:rFonts w:ascii="Times New Roman" w:eastAsia="Aptos" w:hAnsi="Times New Roman" w:cs="Times New Roman"/>
+          <w:b/>
+          <w:bCs/>
+          <w:lang w:eastAsia="en-US"/>
+        </w:rPr>
+      </w:pPr>
+    </w:p>
+    <w:p>
+      <w:pPr>
+        <w:spacing w:after="0" w:line="480" w:lineRule="auto"/>
+        <w:rPr>
+          <w:rFonts w:ascii="Times New Roman" w:eastAsia="Aptos" w:hAnsi="Times New Roman" w:cs="Times New Roman"/>
+          <w:b/>
+          <w:bCs/>
+          <w:lang w:eastAsia="en-US"/>
+        </w:rPr>
+      </w:pPr>
+    </w:p>
+    <w:p>
+      <w:pPr>
+        <w:spacing w:after="0" w:line="480" w:lineRule="auto"/>
+        <w:rPr>
+          <w:rFonts w:ascii="Times New Roman" w:eastAsia="Aptos" w:hAnsi="Times New Roman" w:cs="Times New Roman"/>
+          <w:lang w:eastAsia="en-US"/>
+        </w:rPr>
+      </w:pPr>
+      <w:r>
+        <w:rPr>
+          <w:rFonts w:ascii="Times New Roman" w:eastAsia="Aptos" w:hAnsi="Times New Roman" w:cs="Times New Roman"/>
+          <w:b/>
+          <w:bCs/>
+          <w:lang w:eastAsia="en-US"/>
+        </w:rPr>
+        <w:lastRenderedPageBreak/>
         <w:t>Figure 2.</w:t>
       </w:r>
       <w:r>
@@ -957,21 +991,7 @@
           <w:rFonts w:ascii="Times New Roman" w:eastAsia="Aptos" w:hAnsi="Times New Roman" w:cs="Times New Roman"/>
           <w:lang w:eastAsia="en-US"/>
         </w:rPr>
-        <w:t xml:space="preserve">for </w:t>
-      </w:r>
-      <w:r>
-        <w:rPr>
-          <w:rFonts w:ascii="Times New Roman" w:eastAsia="Aptos" w:hAnsi="Times New Roman" w:cs="Times New Roman"/>
-          <w:lang w:eastAsia="en-US"/>
-        </w:rPr>
-        <w:t>M</w:t>
-      </w:r>
-      <w:r>
-        <w:rPr>
-          <w:rFonts w:ascii="Times New Roman" w:eastAsia="Aptos" w:hAnsi="Times New Roman" w:cs="Times New Roman"/>
-          <w:lang w:eastAsia="en-US"/>
-        </w:rPr>
-        <w:t>ale Participants</w:t>
+        <w:t>for Male Participants</w:t>
       </w:r>
     </w:p>
     <w:p>
@@ -989,7 +1009,6 @@
           <w:noProof/>
           <w:lang w:eastAsia="en-US"/>
         </w:rPr>
-        <w:lastRenderedPageBreak/>
         <w:drawing>
           <wp:inline distT="0" distB="0" distL="0" distR="0" wp14:anchorId="27CF8FE7" wp14:editId="2F009631">
             <wp:extent cx="5943600" cy="3275965"/>
@@ -1151,6 +1170,13 @@
           <w:rFonts w:ascii="Times New Roman" w:eastAsia="Aptos" w:hAnsi="Times New Roman" w:cs="Times New Roman"/>
           <w:lang w:eastAsia="en-US"/>
         </w:rPr>
+        <w:t xml:space="preserve">Note that after complete case analysis for the variables selected no additional participants were excluded. </w:t>
+      </w:r>
+      <w:r>
+        <w:rPr>
+          <w:rFonts w:ascii="Times New Roman" w:eastAsia="Aptos" w:hAnsi="Times New Roman" w:cs="Times New Roman"/>
+          <w:lang w:eastAsia="en-US"/>
+        </w:rPr>
         <w:t xml:space="preserve">Estimated hazard ratios and 95% confidence intervals for both models are presented in Table </w:t>
       </w:r>
       <w:r>
@@ -1165,7 +1191,7 @@
           <w:rFonts w:ascii="Times New Roman" w:eastAsia="Aptos" w:hAnsi="Times New Roman" w:cs="Times New Roman"/>
           <w:lang w:eastAsia="en-US"/>
         </w:rPr>
-        <w:t xml:space="preserve">. In the female model, age and systolic blood pressure were statistically significant predictors of stroke (p &lt; 0.001). Each additional year of age was associated with a 6.8% increase in stroke hazard (HR = 1.068, 95% CI: 1.030, 1.109), and each 1 mmHg increase in systolic blood pressure was associated with a 2.9% increase in stroke hazard (HR = 1.029, 95% CI: 1.021, 1.037). Diabetes status and current smoking status were not statistically significant in females (p = 0.368 and p = 0.322 respectively), though both were associated with increased hazard in the expected direction. </w:t>
+        <w:t xml:space="preserve">. In the female model, age and systolic blood pressure were statistically significant predictors of stroke (p &lt; 0.001). Each additional year of age was associated with a 6.8% increase in stroke hazard (HR = 1.068, 95% CI: 1.030, 1.109), and each 1 mmHg increase in systolic blood pressure was associated with a 2.9% increase in stroke hazard (HR = 1.029, 95% CI: 1.021, </w:t>
       </w:r>
       <w:r>
         <w:rPr>
@@ -1173,7 +1199,21 @@
           <w:lang w:eastAsia="en-US"/>
         </w:rPr>
         <w:lastRenderedPageBreak/>
-        <w:t>In the male model, all four predictors were statistically significant. Each additional year of age was associated with a 7.0% increase in stroke hazard (HR = 1.070, 95% CI: 1.031, 1.110), and each 1 mmHg increase in systolic blood pressure was associated with a 3.2% increase in stroke hazard (HR = 1.032, 95% CI: 1.021, 1.043). Diabetes was associated with a 4.3-fold increase in stroke hazard among males (HR = 4.287, 95% CI: 1.862, 9.873), a notably stronger effect than observed in females (HR = 1.597, 95% CI: 0.576, 4.429). Current smoking status was associated with approximately twice the hazard of stroke compared to non-smokers in males (HR = 2.013, 95% CI: 1.084, 3.738).</w:t>
+        <w:t>1.037). Diabetes status and current smoking status were not statistically significant in females (p = 0.368 and p = 0.322 respectively), though both were associated with increased hazard in the expected direction. In the male model, all four predictors were statistically significant. Each additional year of age was associated with a 7.0% increase in stroke hazard (HR = 1.070, 95% CI: 1.031, 1.110), and each 1 mmHg increase in systolic blood pressure was associated with a 3.2% increase in stroke hazard (HR = 1.032, 95% CI: 1.021, 1.043). Diabetes was associated with a 4.3-fold increase in stroke hazard among males (HR = 4.287, 95% CI: 1.862, 9.873), a notably stronger effect than observed in females</w:t>
+      </w:r>
+      <w:r>
+        <w:rPr>
+          <w:rFonts w:ascii="Times New Roman" w:eastAsia="Aptos" w:hAnsi="Times New Roman" w:cs="Times New Roman"/>
+          <w:lang w:eastAsia="en-US"/>
+        </w:rPr>
+        <w:t xml:space="preserve">. </w:t>
+      </w:r>
+      <w:r>
+        <w:rPr>
+          <w:rFonts w:ascii="Times New Roman" w:eastAsia="Aptos" w:hAnsi="Times New Roman" w:cs="Times New Roman"/>
+          <w:lang w:eastAsia="en-US"/>
+        </w:rPr>
+        <w:t>Current smoking status was associated with approximately twice the hazard of stroke compared to non-smokers in males (HR = 2.013, 95% CI: 1.084, 3.738).</w:t>
       </w:r>
     </w:p>
     <w:p>
@@ -1224,9 +1264,9 @@
           <w:lang w:eastAsia="en-US"/>
         </w:rPr>
         <w:drawing>
-          <wp:inline distT="0" distB="0" distL="0" distR="0" wp14:anchorId="3E24E928" wp14:editId="2651E595">
-            <wp:extent cx="4716654" cy="1607996"/>
-            <wp:effectExtent l="0" t="0" r="0" b="5080"/>
+          <wp:inline distT="0" distB="0" distL="0" distR="0" wp14:anchorId="3E24E928" wp14:editId="337BEDBB">
+            <wp:extent cx="4795736" cy="1634957"/>
+            <wp:effectExtent l="0" t="0" r="5080" b="3810"/>
             <wp:docPr id="860813099" name="Picture 4"/>
             <wp:cNvGraphicFramePr>
               <a:graphicFrameLocks xmlns:a="http://schemas.openxmlformats.org/drawingml/2006/main" noChangeAspect="1"/>
@@ -1253,7 +1293,7 @@
                   <pic:spPr>
                     <a:xfrm>
                       <a:off x="0" y="0"/>
-                      <a:ext cx="4822626" cy="1644124"/>
+                      <a:ext cx="4910418" cy="1674054"/>
                     </a:xfrm>
                     <a:prstGeom prst="rect">
                       <a:avLst/>
@@ -1297,7 +1337,14 @@
           <w:rFonts w:ascii="Times New Roman" w:eastAsia="Aptos" w:hAnsi="Times New Roman" w:cs="Times New Roman"/>
           <w:lang w:eastAsia="en-US"/>
         </w:rPr>
-        <w:t xml:space="preserve">Ten-year stroke-free survival probabilities for five risk profiles at ages 40, 50, and 60 are presented in Table </w:t>
+        <w:t>10</w:t>
+      </w:r>
+      <w:r>
+        <w:rPr>
+          <w:rFonts w:ascii="Times New Roman" w:eastAsia="Aptos" w:hAnsi="Times New Roman" w:cs="Times New Roman"/>
+          <w:lang w:eastAsia="en-US"/>
+        </w:rPr>
+        <w:t xml:space="preserve">-year stroke-free survival probabilities for five risk profiles at ages 40, 50, and 60 are presented in Table </w:t>
       </w:r>
       <w:r>
         <w:rPr>
@@ -1311,7 +1358,7 @@
           <w:rFonts w:ascii="Times New Roman" w:eastAsia="Aptos" w:hAnsi="Times New Roman" w:cs="Times New Roman"/>
           <w:lang w:eastAsia="en-US"/>
         </w:rPr>
-        <w:t xml:space="preserve"> for both sexes. Across all profiles and ages, survival probabilities remained high, reflecting the relatively low overall stroke incidence in this cohort. Among females, the combined high systolic blood pressure and diabetes profile showed the greatest reduction in stroke-free survival, with a 60-year-old female in this profile having a 91.9% probability of remaining stroke-free compared to 98.7% for a healthy 60-year-old female. A similar pattern was observed in males, where the combined high systolic blood pressure and diabetes profile showed the most pronounced reduction in stroke-free survival, with a 60-year-old male having an 80.3% </w:t>
+        <w:t xml:space="preserve"> for both sexes. Across all profiles and ages, survival probabilities remained high, reflecting the relatively low overall stroke incidence in this cohort. Among females, the combined high systolic blood pressure and diabetes profile showed the greatest reduction in stroke-free survival, with a 60-year-old female in this profile having a 91.9% probability of remaining stroke-free compared to 98.7% for a healthy 60-year-old female. A similar pattern was </w:t>
       </w:r>
       <w:r>
         <w:rPr>
@@ -1319,7 +1366,7 @@
           <w:lang w:eastAsia="en-US"/>
         </w:rPr>
         <w:lastRenderedPageBreak/>
-        <w:t>probability of remaining stroke-free — notably lower than the corresponding female probability of 91.9%. Across all profiles, older age was consistently associated with lower stroke-free survival, and males in the high-risk combined profile showed substantially lower survival probabilities than their female counterparts.</w:t>
+        <w:t>observed in males, where the combined high systolic blood pressure and diabetes profile showed the most pronounced reduction in stroke-free survival, with a 60-year-old male having an 80.3% probability of remaining stroke-free. Across all profiles, older age was consistently associated with lower stroke-free survival, and males in the high-risk combined profile showed substantially lower survival probabilities than their female counterparts.</w:t>
       </w:r>
     </w:p>
     <w:p>
@@ -1454,7 +1501,58 @@
           <w:rFonts w:ascii="Times New Roman" w:eastAsia="Aptos" w:hAnsi="Times New Roman" w:cs="Times New Roman"/>
           <w:lang w:eastAsia="en-US"/>
         </w:rPr>
-        <w:t xml:space="preserve">To assess whether systolic blood pressure and diabetes status varied meaningfully over time, both variables were examined descriptively across three study periods, stratified by sex (Table X). Mean systolic blood pressure increased across periods for both sexes, rising from 131.7 mmHg (SD = 19.4) to 139.3 mmHg (SD = 21.2) in females and from 133.8 mmHg (SD = 24.5) to 140.9 mmHg (SD = 24.1) in males. Diabetes prevalence more than doubled across periods in both sexes. At the individual level, 69.5% of participants experienced a clinically meaningful change in systolic blood pressure (≥10 mmHg), exceeding the 10% threshold, while only 4.9% experienced a change in diabetes status, falling below it. Given the substantial individual-level variation in systolic blood pressure, a time-varying covariate model is recommended for future </w:t>
+        <w:t xml:space="preserve">To assess whether systolic blood pressure and diabetes status varied meaningfully over time, both variables were examined descriptively across three study periods, stratified by sex (Table </w:t>
+      </w:r>
+      <w:r>
+        <w:rPr>
+          <w:rFonts w:ascii="Times New Roman" w:eastAsia="Aptos" w:hAnsi="Times New Roman" w:cs="Times New Roman"/>
+          <w:lang w:eastAsia="en-US"/>
+        </w:rPr>
+        <w:t>4</w:t>
+      </w:r>
+      <w:r>
+        <w:rPr>
+          <w:rFonts w:ascii="Times New Roman" w:eastAsia="Aptos" w:hAnsi="Times New Roman" w:cs="Times New Roman"/>
+          <w:lang w:eastAsia="en-US"/>
+        </w:rPr>
+        <w:t>). Mean systolic blood pressure increased across periods for both sexes, rising from 131.7 mmHg (SD = 19.4) to 139.3 mmHg (SD = 21.2) in females and from 133.8 mmHg (SD = 24.5) to 140.9 mmHg (SD = 24.1) in males. Diabetes prevalence more than doubled across periods in both sexes. At the individual level, 69.5% of participants experienced a clinically meaningful change in systolic blood pressure (≥10 mmHg), exceeding the 10% threshold</w:t>
+      </w:r>
+      <w:r>
+        <w:rPr>
+          <w:rFonts w:ascii="Times New Roman" w:eastAsia="Aptos" w:hAnsi="Times New Roman" w:cs="Times New Roman"/>
+          <w:lang w:eastAsia="en-US"/>
+        </w:rPr>
+        <w:t xml:space="preserve"> set by the investigator.</w:t>
+      </w:r>
+      <w:r>
+        <w:rPr>
+          <w:rFonts w:ascii="Times New Roman" w:eastAsia="Aptos" w:hAnsi="Times New Roman" w:cs="Times New Roman"/>
+          <w:lang w:eastAsia="en-US"/>
+        </w:rPr>
+        <w:t xml:space="preserve"> </w:t>
+      </w:r>
+      <w:r>
+        <w:rPr>
+          <w:rFonts w:ascii="Times New Roman" w:eastAsia="Aptos" w:hAnsi="Times New Roman" w:cs="Times New Roman"/>
+          <w:lang w:eastAsia="en-US"/>
+        </w:rPr>
+        <w:t xml:space="preserve">On the other </w:t>
+      </w:r>
+      <w:proofErr w:type="gramStart"/>
+      <w:r>
+        <w:rPr>
+          <w:rFonts w:ascii="Times New Roman" w:eastAsia="Aptos" w:hAnsi="Times New Roman" w:cs="Times New Roman"/>
+          <w:lang w:eastAsia="en-US"/>
+        </w:rPr>
+        <w:t>hand</w:t>
+      </w:r>
+      <w:proofErr w:type="gramEnd"/>
+      <w:r>
+        <w:rPr>
+          <w:rFonts w:ascii="Times New Roman" w:eastAsia="Aptos" w:hAnsi="Times New Roman" w:cs="Times New Roman"/>
+          <w:lang w:eastAsia="en-US"/>
+        </w:rPr>
+        <w:t xml:space="preserve"> only 4.9% experienced a change in diabetes status, falling below </w:t>
       </w:r>
       <w:r>
         <w:rPr>
@@ -1462,7 +1560,14 @@
           <w:lang w:eastAsia="en-US"/>
         </w:rPr>
         <w:lastRenderedPageBreak/>
-        <w:t>analyses to more accurately capture its dynamic influence on stroke risk over the follow-up period.</w:t>
+        <w:t>the threshold</w:t>
+      </w:r>
+      <w:r>
+        <w:rPr>
+          <w:rFonts w:ascii="Times New Roman" w:eastAsia="Aptos" w:hAnsi="Times New Roman" w:cs="Times New Roman"/>
+          <w:lang w:eastAsia="en-US"/>
+        </w:rPr>
+        <w:t>. Given the substantial individual-level variation in systolic blood pressure, a time-varying covariate model is recommended for future analyses to more accurately capture its dynamic influence on stroke risk over the follow-up period.</w:t>
       </w:r>
     </w:p>
     <w:p>
@@ -1581,7 +1686,7 @@
           <w:rFonts w:ascii="Times New Roman" w:eastAsia="Aptos" w:hAnsi="Times New Roman" w:cs="Times New Roman"/>
           <w:lang w:eastAsia="en-US"/>
         </w:rPr>
-        <w:t>This analysis examined 10-year stroke-free survival among 4,402 Framingham Heart Study participants using Cox proportional hazards models fit separately for males and females. Age and systolic blood pressure were significant predictors of stroke in both sexes, consistent with established cardiovascular disease literature. The most notable finding was the substantially stronger effect of diabetes in males (HR = 4.287) compared to females (HR = 1.597), which was not statistically significant, potentially reflecting true biological differences or limited statistical power given the relatively small number of events. Current smoking was a significant predictor only in males, which is consistent with findings in the broader literature. The risk profile analysis highlighted that the combined presence of hypertension and diabetes produced the greatest reductions in stroke-free survival, particularly among older males.</w:t>
+        <w:t>This analysis examined 10-year stroke-free survival among 4,402 Framingham Heart Study participants using Cox proportional hazards models fit separately for males and females. Age and systolic blood pressure were significant predictors of stroke in both sexes. The most notable finding was the substantially stronger effect of diabetes in males (HR = 4.287) compared to females (HR = 1.597), which was not statistically significant, potentially reflecting true biological differences or limited statistical power given the relatively small number of events. Current smoking was a significant predictor only in males. The risk profile analysis highlighted that the combined presence of hypertension and diabetes produced the greatest reductions in stroke-free survival, particularly among older males.</w:t>
       </w:r>
     </w:p>
     <w:p>
@@ -1774,13 +1879,7 @@
         <w:rPr>
           <w:rStyle w:val="Strong"/>
         </w:rPr>
-        <w:t xml:space="preserve">Figure </w:t>
-      </w:r>
-      <w:r>
-        <w:rPr>
-          <w:rStyle w:val="Strong"/>
-        </w:rPr>
-        <w:t>3.</w:t>
+        <w:t>Figure 3.</w:t>
       </w:r>
       <w:r>
         <w:t xml:space="preserve"> Schoenfeld Residual Plots for Female Cox Proportional Hazards Model</w:t>
@@ -1850,19 +1949,7 @@
         <w:rPr>
           <w:rStyle w:val="Strong"/>
         </w:rPr>
-        <w:t xml:space="preserve">Figure </w:t>
-      </w:r>
-      <w:r>
-        <w:rPr>
-          <w:rStyle w:val="Strong"/>
-        </w:rPr>
-        <w:t>4</w:t>
-      </w:r>
-      <w:r>
-        <w:rPr>
-          <w:rStyle w:val="Strong"/>
-        </w:rPr>
-        <w:t>.</w:t>
+        <w:t>Figure 4.</w:t>
       </w:r>
       <w:r>
         <w:t xml:space="preserve"> Schoenfeld Residual Plots for Male Cox Proportional Hazards Model</w:t>
@@ -2622,6 +2709,7 @@
   <w:style w:type="character" w:default="1" w:styleId="DefaultParagraphFont">
     <w:name w:val="Default Paragraph Font"/>
     <w:uiPriority w:val="1"/>
+    <w:semiHidden/>
     <w:unhideWhenUsed/>
   </w:style>
   <w:style w:type="table" w:default="1" w:styleId="TableNormal">

</xml_diff>